<commit_message>
Add Book management project
</commit_message>
<xml_diff>
--- a/CV Momen Ahmed.docx
+++ b/CV Momen Ahmed.docx
@@ -195,6 +195,58 @@
             <w:szCs w:val="20"/>
           </w:rPr>
           <w:t>GitHub/Momen054</w:t>
+        </w:r>
+      </w:hyperlink>
+      <w:r>
+        <w:rPr>
+          <w:rFonts w:hint="cs"/>
+          <w:rtl/>
+        </w:rPr>
+        <w:t xml:space="preserve"> </w:t>
+      </w:r>
+      <w:r>
+        <w:rPr>
+          <w:rFonts w:asciiTheme="majorBidi" w:hAnsiTheme="majorBidi" w:cstheme="majorBidi"/>
+          <w:sz w:val="20"/>
+          <w:szCs w:val="20"/>
+        </w:rPr>
+        <w:t>||</w:t>
+      </w:r>
+      <w:r>
+        <w:rPr>
+          <w:rFonts w:asciiTheme="majorBidi" w:hAnsiTheme="majorBidi" w:cstheme="majorBidi"/>
+          <w:sz w:val="20"/>
+          <w:szCs w:val="20"/>
+        </w:rPr>
+        <w:t xml:space="preserve"> </w:t>
+      </w:r>
+      <w:hyperlink r:id="rId9" w:history="1">
+        <w:r>
+          <w:rPr>
+            <w:rStyle w:val="Hyperlink"/>
+            <w:rFonts w:asciiTheme="majorBidi" w:hAnsiTheme="majorBidi" w:cstheme="majorBidi"/>
+            <w:sz w:val="20"/>
+            <w:szCs w:val="20"/>
+          </w:rPr>
+          <w:t>Portfoli</w:t>
+        </w:r>
+        <w:r>
+          <w:rPr>
+            <w:rStyle w:val="Hyperlink"/>
+            <w:rFonts w:asciiTheme="majorBidi" w:hAnsiTheme="majorBidi" w:cstheme="majorBidi"/>
+            <w:sz w:val="20"/>
+            <w:szCs w:val="20"/>
+          </w:rPr>
+          <w:t>o</w:t>
+        </w:r>
+        <w:r>
+          <w:rPr>
+            <w:rStyle w:val="Hyperlink"/>
+            <w:rFonts w:asciiTheme="majorBidi" w:hAnsiTheme="majorBidi" w:cstheme="majorBidi"/>
+            <w:sz w:val="20"/>
+            <w:szCs w:val="20"/>
+          </w:rPr>
+          <w:t xml:space="preserve"> &amp; Projects</w:t>
         </w:r>
       </w:hyperlink>
     </w:p>
@@ -1488,7 +1540,25 @@
           <w:sz w:val="22"/>
           <w:szCs w:val="22"/>
         </w:rPr>
-        <w:t>Learned LINQ query and method syntax, filtering, sorting, joins, and asynchronous queries, along with Entity Framework Core, Code First, Dbcontext, entity relationships, migrations, tracking, and database querying with SQL Server.</w:t>
+        <w:t xml:space="preserve">Learned LINQ query and method syntax, filtering, sorting, joins, and asynchronous queries, along with Entity Framework Core, Code First, </w:t>
+      </w:r>
+      <w:proofErr w:type="spellStart"/>
+      <w:r>
+        <w:rPr>
+          <w:rFonts w:asciiTheme="majorBidi" w:hAnsiTheme="majorBidi" w:cstheme="majorBidi"/>
+          <w:sz w:val="22"/>
+          <w:szCs w:val="22"/>
+        </w:rPr>
+        <w:t>Dbcontext</w:t>
+      </w:r>
+      <w:proofErr w:type="spellEnd"/>
+      <w:r>
+        <w:rPr>
+          <w:rFonts w:asciiTheme="majorBidi" w:hAnsiTheme="majorBidi" w:cstheme="majorBidi"/>
+          <w:sz w:val="22"/>
+          <w:szCs w:val="22"/>
+        </w:rPr>
+        <w:t>, entity relationships, migrations, tracking, and database querying with SQL Server.</w:t>
       </w:r>
     </w:p>
     <w:p>
@@ -1501,13 +1571,23 @@
           <w:bCs/>
         </w:rPr>
       </w:pPr>
-      <w:r>
-        <w:rPr>
-          <w:rFonts w:asciiTheme="majorBidi" w:hAnsiTheme="majorBidi" w:cstheme="majorBidi"/>
-          <w:b/>
-          <w:bCs/>
-        </w:rPr>
-        <w:t xml:space="preserve">ASP.NET.Core &amp; Backend </w:t>
+      <w:proofErr w:type="spellStart"/>
+      <w:r>
+        <w:rPr>
+          <w:rFonts w:asciiTheme="majorBidi" w:hAnsiTheme="majorBidi" w:cstheme="majorBidi"/>
+          <w:b/>
+          <w:bCs/>
+        </w:rPr>
+        <w:t>ASP.NET.Core</w:t>
+      </w:r>
+      <w:proofErr w:type="spellEnd"/>
+      <w:r>
+        <w:rPr>
+          <w:rFonts w:asciiTheme="majorBidi" w:hAnsiTheme="majorBidi" w:cstheme="majorBidi"/>
+          <w:b/>
+          <w:bCs/>
+        </w:rPr>
+        <w:t xml:space="preserve"> &amp; Backend </w:t>
       </w:r>
       <w:r>
         <w:rPr>
@@ -1603,7 +1683,43 @@
           <w:sz w:val="22"/>
           <w:szCs w:val="22"/>
         </w:rPr>
-        <w:t>Learned ASP.NET Core Web API development, RESTful API design, routing, controllers, dependency injection, middleware, model, validation, authentication and authorization, JWT, Identity, AutoMapper, FluentValidation, and backend architecture principles.</w:t>
+        <w:t xml:space="preserve">Learned ASP.NET Core Web API development, RESTful API design, routing, controllers, dependency injection, middleware, model, validation, authentication and authorization, JWT, Identity, </w:t>
+      </w:r>
+      <w:proofErr w:type="spellStart"/>
+      <w:r>
+        <w:rPr>
+          <w:rFonts w:asciiTheme="majorBidi" w:hAnsiTheme="majorBidi" w:cstheme="majorBidi"/>
+          <w:sz w:val="22"/>
+          <w:szCs w:val="22"/>
+        </w:rPr>
+        <w:t>AutoMapper</w:t>
+      </w:r>
+      <w:proofErr w:type="spellEnd"/>
+      <w:r>
+        <w:rPr>
+          <w:rFonts w:asciiTheme="majorBidi" w:hAnsiTheme="majorBidi" w:cstheme="majorBidi"/>
+          <w:sz w:val="22"/>
+          <w:szCs w:val="22"/>
+        </w:rPr>
+        <w:t xml:space="preserve">, </w:t>
+      </w:r>
+      <w:proofErr w:type="spellStart"/>
+      <w:r>
+        <w:rPr>
+          <w:rFonts w:asciiTheme="majorBidi" w:hAnsiTheme="majorBidi" w:cstheme="majorBidi"/>
+          <w:sz w:val="22"/>
+          <w:szCs w:val="22"/>
+        </w:rPr>
+        <w:t>FluentValidation</w:t>
+      </w:r>
+      <w:proofErr w:type="spellEnd"/>
+      <w:r>
+        <w:rPr>
+          <w:rFonts w:asciiTheme="majorBidi" w:hAnsiTheme="majorBidi" w:cstheme="majorBidi"/>
+          <w:sz w:val="22"/>
+          <w:szCs w:val="22"/>
+        </w:rPr>
+        <w:t>, and backend architecture principles.</w:t>
       </w:r>
     </w:p>
     <w:p>
@@ -1922,7 +2038,7 @@
           <w:bCs/>
         </w:rPr>
       </w:pPr>
-      <w:hyperlink r:id="rId9" w:history="1">
+      <w:hyperlink r:id="rId10" w:history="1">
         <w:r>
           <w:rPr>
             <w:rStyle w:val="Hyperlink"/>
@@ -2002,7 +2118,7 @@
           <w:bCs/>
         </w:rPr>
       </w:pPr>
-      <w:hyperlink r:id="rId10" w:history="1">
+      <w:hyperlink r:id="rId11" w:history="1">
         <w:r>
           <w:rPr>
             <w:rStyle w:val="Hyperlink"/>
@@ -2010,7 +2126,17 @@
             <w:b/>
             <w:bCs/>
           </w:rPr>
-          <w:t xml:space="preserve">Hotel Management </w:t>
+          <w:t xml:space="preserve">Hotel </w:t>
+        </w:r>
+        <w:proofErr w:type="gramStart"/>
+        <w:r>
+          <w:rPr>
+            <w:rStyle w:val="Hyperlink"/>
+            <w:rFonts w:asciiTheme="majorBidi" w:hAnsiTheme="majorBidi" w:cstheme="majorBidi"/>
+            <w:b/>
+            <w:bCs/>
+          </w:rPr>
+          <w:t xml:space="preserve">Management </w:t>
         </w:r>
         <w:r>
           <w:rPr>
@@ -2028,7 +2154,27 @@
             <w:b/>
             <w:bCs/>
           </w:rPr>
-          <w:t xml:space="preserve">RESTful API  </w:t>
+          <w:t>RESTful</w:t>
+        </w:r>
+        <w:proofErr w:type="gramEnd"/>
+        <w:r>
+          <w:rPr>
+            <w:rStyle w:val="Hyperlink"/>
+            <w:rFonts w:asciiTheme="majorBidi" w:hAnsiTheme="majorBidi" w:cstheme="majorBidi"/>
+            <w:b/>
+            <w:bCs/>
+          </w:rPr>
+          <w:t xml:space="preserve"> </w:t>
+        </w:r>
+        <w:proofErr w:type="gramStart"/>
+        <w:r>
+          <w:rPr>
+            <w:rStyle w:val="Hyperlink"/>
+            <w:rFonts w:asciiTheme="majorBidi" w:hAnsiTheme="majorBidi" w:cstheme="majorBidi"/>
+            <w:b/>
+            <w:bCs/>
+          </w:rPr>
+          <w:t xml:space="preserve">API  </w:t>
         </w:r>
         <w:r>
           <w:rPr>
@@ -2037,7 +2183,17 @@
             <w:b/>
             <w:bCs/>
           </w:rPr>
-          <w:t xml:space="preserve">| </w:t>
+          <w:t>|</w:t>
+        </w:r>
+        <w:proofErr w:type="gramEnd"/>
+        <w:r>
+          <w:rPr>
+            <w:rStyle w:val="Hyperlink"/>
+            <w:rFonts w:asciiTheme="majorBidi" w:hAnsiTheme="majorBidi" w:cstheme="majorBidi"/>
+            <w:b/>
+            <w:bCs/>
+          </w:rPr>
+          <w:t xml:space="preserve"> </w:t>
         </w:r>
         <w:r>
           <w:rPr>
@@ -2388,14 +2544,34 @@
           <w:szCs w:val="22"/>
         </w:rPr>
       </w:pPr>
-      <w:r>
-        <w:rPr>
-          <w:rFonts w:asciiTheme="majorBidi" w:hAnsiTheme="majorBidi" w:cstheme="majorBidi"/>
-          <w:sz w:val="22"/>
-          <w:szCs w:val="22"/>
-        </w:rPr>
-        <w:t>FluentValidation, AutoMapper</w:t>
-      </w:r>
+      <w:proofErr w:type="spellStart"/>
+      <w:r>
+        <w:rPr>
+          <w:rFonts w:asciiTheme="majorBidi" w:hAnsiTheme="majorBidi" w:cstheme="majorBidi"/>
+          <w:sz w:val="22"/>
+          <w:szCs w:val="22"/>
+        </w:rPr>
+        <w:t>FluentValidation</w:t>
+      </w:r>
+      <w:proofErr w:type="spellEnd"/>
+      <w:r>
+        <w:rPr>
+          <w:rFonts w:asciiTheme="majorBidi" w:hAnsiTheme="majorBidi" w:cstheme="majorBidi"/>
+          <w:sz w:val="22"/>
+          <w:szCs w:val="22"/>
+        </w:rPr>
+        <w:t xml:space="preserve">, </w:t>
+      </w:r>
+      <w:proofErr w:type="spellStart"/>
+      <w:r>
+        <w:rPr>
+          <w:rFonts w:asciiTheme="majorBidi" w:hAnsiTheme="majorBidi" w:cstheme="majorBidi"/>
+          <w:sz w:val="22"/>
+          <w:szCs w:val="22"/>
+        </w:rPr>
+        <w:t>AutoMapper</w:t>
+      </w:r>
+      <w:proofErr w:type="spellEnd"/>
     </w:p>
     <w:p>
       <w:pPr>
@@ -8932,7 +9108,6 @@
   <w:style w:type="character" w:default="1" w:styleId="DefaultParagraphFont">
     <w:name w:val="Default Paragraph Font"/>
     <w:uiPriority w:val="1"/>
-    <w:semiHidden/>
     <w:unhideWhenUsed/>
   </w:style>
   <w:style w:type="table" w:default="1" w:styleId="TableNormal">

</xml_diff>